<commit_message>
adding language for container secrets management
</commit_message>
<xml_diff>
--- a/review_artifacts/agent-module-distributed-microservices-redline.docx
+++ b/review_artifacts/agent-module-distributed-microservices-redline.docx
@@ -43,7 +43,7 @@
       </w:r>
     </w:p>
     <w:p>
-      <w:ins w:id="1" w:author="Codex draft" w:date="2026-05-12T15:06:48Z">
+      <w:ins w:id="1" w:author="Codex draft" w:date="2026-05-12T16:11:17Z">
         <w:r>
           <w:rPr>
             <w:color w:val="0070C0"/>
@@ -54,7 +54,7 @@
       </w:ins>
     </w:p>
     <w:p>
-      <w:ins w:id="2" w:author="Codex draft" w:date="2026-05-12T15:06:48Z">
+      <w:ins w:id="2" w:author="Codex draft" w:date="2026-05-12T16:11:17Z">
         <w:r>
           <w:rPr>
             <w:color w:val="0070C0"/>
@@ -73,7 +73,7 @@
       </w:r>
     </w:p>
     <w:p>
-      <w:ins w:id="3" w:author="Codex draft" w:date="2026-05-12T15:06:48Z">
+      <w:ins w:id="3" w:author="Codex draft" w:date="2026-05-12T16:11:17Z">
         <w:r>
           <w:rPr>
             <w:color w:val="0070C0"/>
@@ -84,7 +84,7 @@
       </w:ins>
     </w:p>
     <w:p>
-      <w:ins w:id="4" w:author="Codex draft" w:date="2026-05-12T15:06:48Z">
+      <w:ins w:id="4" w:author="Codex draft" w:date="2026-05-12T16:11:17Z">
         <w:r>
           <w:rPr>
             <w:color w:val="0070C0"/>
@@ -95,7 +95,7 @@
       </w:ins>
     </w:p>
     <w:p>
-      <w:ins w:id="5" w:author="Codex draft" w:date="2026-05-12T15:06:48Z">
+      <w:ins w:id="5" w:author="Codex draft" w:date="2026-05-12T16:11:17Z">
         <w:r>
           <w:rPr>
             <w:color w:val="0070C0"/>
@@ -114,7 +114,7 @@
       </w:r>
     </w:p>
     <w:p>
-      <w:del w:id="6" w:author="Codex draft" w:date="2026-05-12T15:06:48Z">
+      <w:del w:id="6" w:author="Codex draft" w:date="2026-05-12T16:11:17Z">
         <w:r>
           <w:rPr>
             <w:color w:val="C00000"/>
@@ -123,7 +123,7 @@
           <w:delText xml:space="preserve">An Agent can communicate with a Server or another Agent.</w:delText>
         </w:r>
       </w:del>
-      <w:ins w:id="7" w:author="Codex draft" w:date="2026-05-12T15:06:48Z">
+      <w:ins w:id="7" w:author="Codex draft" w:date="2026-05-12T16:11:17Z">
         <w:r>
           <w:rPr>
             <w:color w:val="0070C0"/>

</xml_diff>